<commit_message>
Updates for 2.15 release
</commit_message>
<xml_diff>
--- a/documentation/RGA_RELEASE_NOTES.docx
+++ b/documentation/RGA_RELEASE_NOTES.docx
@@ -15,35 +15,31 @@
           <w:sz w:val="52"/>
           <w:szCs w:val="52"/>
         </w:rPr>
-        <w:t>Radeon™ GPU Analyzer 2.</w:t>
+        <w:t>Radeon™ GPU Analyzer 2.15.0 – Release Notes</w:t>
       </w:r>
       <w:r>
         <w:rPr>
           <w:sz w:val="52"/>
           <w:szCs w:val="52"/>
         </w:rPr>
-        <w:t>1</w:t>
       </w:r>
       <w:r>
         <w:rPr>
           <w:sz w:val="52"/>
           <w:szCs w:val="52"/>
         </w:rPr>
-        <w:t>4</w:t>
       </w:r>
       <w:r>
         <w:rPr>
           <w:sz w:val="52"/>
           <w:szCs w:val="52"/>
         </w:rPr>
-        <w:t>.2</w:t>
       </w:r>
       <w:r>
         <w:rPr>
           <w:sz w:val="52"/>
           <w:szCs w:val="52"/>
         </w:rPr>
-        <w:t xml:space="preserve"> – Release Notes</w:t>
       </w:r>
     </w:p>
     <w:p>
@@ -73,37 +69,7 @@
           <w:sz w:val="20"/>
           <w:szCs w:val="20"/>
         </w:rPr>
-        <w:t>Updated the disassembler, addressing a few stability issues.</w:t>
-      </w:r>
-    </w:p>
-    <w:p>
-      <w:pPr>
-        <w:shd w:val="clear" w:color="auto" w:fill="FFFFFF"/>
-        <w:spacing w:before="100" w:beforeAutospacing="1" w:after="100" w:afterAutospacing="1" w:line="240" w:lineRule="auto"/>
-        <w:rPr>
-          <w:b/>
-          <w:bCs/>
-          <w:sz w:val="20"/>
-          <w:szCs w:val="20"/>
-        </w:rPr>
-      </w:pPr>
-      <w:r>
-        <w:rPr>
-          <w:b/>
-          <w:bCs/>
-          <w:sz w:val="20"/>
-          <w:szCs w:val="20"/>
-        </w:rPr>
-        <w:t>Notes:</w:t>
-      </w:r>
-      <w:r>
-        <w:rPr>
-          <w:b/>
-          <w:bCs/>
-          <w:sz w:val="20"/>
-          <w:szCs w:val="20"/>
-        </w:rPr>
-        <w:t xml:space="preserve"> </w:t>
+        <w:t>Added support for the CDNA™ 5 (gfx1250) GPU architecture in Binary Analysis mode (for precompiled HIP Code Object binaries) and OpenCL mode.</w:t>
       </w:r>
     </w:p>
     <w:p>
@@ -125,53 +91,7 @@
           <w:sz w:val="20"/>
           <w:szCs w:val="20"/>
         </w:rPr>
-        <w:t xml:space="preserve">With the introduction of 25.20-based Linux drivers, the AMDVLK driver is no longer included in the </w:t>
-      </w:r>
-      <w:proofErr w:type="spellStart"/>
-      <w:r>
-        <w:rPr>
-          <w:sz w:val="20"/>
-          <w:szCs w:val="20"/>
-        </w:rPr>
-        <w:t>amdgpu</w:t>
-      </w:r>
-      <w:proofErr w:type="spellEnd"/>
-      <w:r>
-        <w:rPr>
-          <w:sz w:val="20"/>
-          <w:szCs w:val="20"/>
-        </w:rPr>
-        <w:t xml:space="preserve">-pro driver package. This is a result of the AMDVLK open-source project being discontinued as mentioned here (https://github.com/GPUOpen-Drivers/AMDVLK/discussions/416). Instead, the RADV open-source Vulkan® driver is installed by default. Consequently, live driver compilation of Vulkan pipelines using RGA is no longer supported with the latest drivers. For a limited transition period, RGA will still bundle the latest amdvlk64.so from the latest 25.10 </w:t>
-      </w:r>
-      <w:proofErr w:type="spellStart"/>
-      <w:r>
-        <w:rPr>
-          <w:sz w:val="20"/>
-          <w:szCs w:val="20"/>
-        </w:rPr>
-        <w:t>amdgpu</w:t>
-      </w:r>
-      <w:proofErr w:type="spellEnd"/>
-      <w:r>
-        <w:rPr>
-          <w:sz w:val="20"/>
-          <w:szCs w:val="20"/>
-        </w:rPr>
-        <w:t xml:space="preserve">-pro driver release which </w:t>
-      </w:r>
-      <w:r>
-        <w:rPr>
-          <w:sz w:val="20"/>
-          <w:szCs w:val="20"/>
-        </w:rPr>
-        <w:t>can be</w:t>
-      </w:r>
-      <w:r>
-        <w:rPr>
-          <w:sz w:val="20"/>
-          <w:szCs w:val="20"/>
-        </w:rPr>
-        <w:t xml:space="preserve"> used for reference. RGA will also continue to support Vulkan pipeline compilation on Linux through its offline Vulkan mode.</w:t>
+        <w:t>Binary Analysis mode: source-to-ISA line correlation is now supported for Code Object binaries which include debug information (requires that the Code Object binary being analyzed is compiled with debug information).</w:t>
       </w:r>
     </w:p>
     <w:p>
@@ -193,7 +113,7 @@
           <w:sz w:val="20"/>
           <w:szCs w:val="20"/>
         </w:rPr>
-        <w:t>With the upgraded ISA disassembly view clock cycle estimates are no longer presented.</w:t>
+        <w:t>Vulkan mode: source-to-ISA line correlation is now supported for both offline and live driver compilation, and is displayed automatically by the GUI when debug info is available. This feature is experimental in the current release.</w:t>
       </w:r>
     </w:p>
     <w:p>
@@ -215,7 +135,7 @@
           <w:sz w:val="20"/>
           <w:szCs w:val="20"/>
         </w:rPr>
-        <w:t>Clock cycle estimates are no longer presented by the upgraded ISA disassembly view in RGA GUI application.</w:t>
+        <w:t>AGPR (Accumulator GPR) usage is now displayed in the resource usage view for supported devices, separately from standard VGPR usage.</w:t>
       </w:r>
     </w:p>
     <w:p>
@@ -237,7 +157,7 @@
           <w:sz w:val="20"/>
           <w:szCs w:val="20"/>
         </w:rPr>
-        <w:t>The new disassembly view presents Functional Groups, leveraging the AMD GPU machine-readable ISA documentation.</w:t>
+        <w:t>DX12 mode: added mesh shader pipeline support.</w:t>
       </w:r>
     </w:p>
     <w:p>
@@ -259,23 +179,37 @@
           <w:sz w:val="20"/>
           <w:szCs w:val="20"/>
         </w:rPr>
-        <w:t xml:space="preserve">For backward compatibility, the RGA CLI output presents Cycle estimates and Functional Unit fields </w:t>
-      </w:r>
-      <w:proofErr w:type="gramStart"/>
-      <w:r>
-        <w:rPr>
-          <w:sz w:val="20"/>
-          <w:szCs w:val="20"/>
-        </w:rPr>
-        <w:t>similar to</w:t>
-      </w:r>
-      <w:proofErr w:type="gramEnd"/>
-      <w:r>
-        <w:rPr>
-          <w:sz w:val="20"/>
-          <w:szCs w:val="20"/>
-        </w:rPr>
-        <w:t xml:space="preserve"> RGA 2.11.</w:t>
+        <w:t>The RGA CLI can now generate a single session summary XML file with the entire output of the session, including ISA, static HW allocation statistics, live register analysis, and CFG for all analyzed binaries or shaders (use --session-summary).</w:t>
+      </w:r>
+    </w:p>
+    <w:p>
+      <w:pPr>
+        <w:shd w:val="clear" w:color="auto" w:fill="FFFFFF"/>
+        <w:spacing w:before="100" w:beforeAutospacing="1" w:after="100" w:afterAutospacing="1" w:line="240" w:lineRule="auto"/>
+        <w:rPr>
+          <w:b/>
+          <w:bCs/>
+          <w:sz w:val="20"/>
+          <w:szCs w:val="20"/>
+        </w:rPr>
+      </w:pPr>
+      <w:r>
+        <w:rPr>
+          <w:b/>
+          <w:bCs/>
+          <w:sz w:val="20"/>
+          <w:szCs w:val="20"/>
+        </w:rPr>
+        <w:t>Notes:</w:t>
+      </w:r>
+      <w:r>
+        <w:rPr>
+          <w:b/>
+          <w:bCs/>
+          <w:sz w:val="20"/>
+          <w:szCs w:val="20"/>
+        </w:rPr>
+        <w:t xml:space="preserve"> </w:t>
       </w:r>
     </w:p>
     <w:p>
@@ -297,6 +231,178 @@
           <w:sz w:val="20"/>
           <w:szCs w:val="20"/>
         </w:rPr>
+        <w:t xml:space="preserve">With the introduction of 25.20-based Linux drivers, the AMDVLK driver is no longer included in the </w:t>
+      </w:r>
+      <w:proofErr w:type="spellStart"/>
+      <w:r>
+        <w:rPr>
+          <w:sz w:val="20"/>
+          <w:szCs w:val="20"/>
+        </w:rPr>
+        <w:t>amdgpu</w:t>
+      </w:r>
+      <w:proofErr w:type="spellEnd"/>
+      <w:r>
+        <w:rPr>
+          <w:sz w:val="20"/>
+          <w:szCs w:val="20"/>
+        </w:rPr>
+        <w:t xml:space="preserve">-pro driver package. This is a result of the AMDVLK open-source project being discontinued as mentioned here (https://github.com/GPUOpen-Drivers/AMDVLK/discussions/416). Instead, the RADV open-source Vulkan® driver is installed by default. Consequently, live driver compilation of Vulkan pipelines using RGA is no longer supported with the latest drivers. For a limited transition period, RGA will still bundle the latest amdvlk64.so from the latest 25.10 </w:t>
+      </w:r>
+      <w:proofErr w:type="spellStart"/>
+      <w:r>
+        <w:rPr>
+          <w:sz w:val="20"/>
+          <w:szCs w:val="20"/>
+        </w:rPr>
+        <w:t>amdgpu</w:t>
+      </w:r>
+      <w:proofErr w:type="spellEnd"/>
+      <w:r>
+        <w:rPr>
+          <w:sz w:val="20"/>
+          <w:szCs w:val="20"/>
+        </w:rPr>
+        <w:t xml:space="preserve">-pro driver release which </w:t>
+      </w:r>
+      <w:r>
+        <w:rPr>
+          <w:sz w:val="20"/>
+          <w:szCs w:val="20"/>
+        </w:rPr>
+        <w:t>can be</w:t>
+      </w:r>
+      <w:r>
+        <w:rPr>
+          <w:sz w:val="20"/>
+          <w:szCs w:val="20"/>
+        </w:rPr>
+        <w:t xml:space="preserve"> used for reference. RGA will also continue to support Vulkan pipeline compilation on Linux through its offline Vulkan mode.</w:t>
+      </w:r>
+    </w:p>
+    <w:p>
+      <w:pPr>
+        <w:pStyle w:val="ListParagraph"/>
+        <w:numPr>
+          <w:ilvl w:val="0"/>
+          <w:numId w:val="14"/>
+        </w:numPr>
+        <w:shd w:val="clear" w:color="auto" w:fill="FFFFFF"/>
+        <w:spacing w:before="100" w:beforeAutospacing="1" w:after="100" w:afterAutospacing="1" w:line="240" w:lineRule="auto"/>
+        <w:rPr>
+          <w:sz w:val="20"/>
+          <w:szCs w:val="20"/>
+        </w:rPr>
+      </w:pPr>
+      <w:r>
+        <w:rPr>
+          <w:sz w:val="20"/>
+          <w:szCs w:val="20"/>
+        </w:rPr>
+        <w:t>With the upgraded ISA disassembly view clock cycle estimates are no longer presented.</w:t>
+      </w:r>
+    </w:p>
+    <w:p>
+      <w:pPr>
+        <w:pStyle w:val="ListParagraph"/>
+        <w:numPr>
+          <w:ilvl w:val="0"/>
+          <w:numId w:val="14"/>
+        </w:numPr>
+        <w:shd w:val="clear" w:color="auto" w:fill="FFFFFF"/>
+        <w:spacing w:before="100" w:beforeAutospacing="1" w:after="100" w:afterAutospacing="1" w:line="240" w:lineRule="auto"/>
+        <w:rPr>
+          <w:sz w:val="20"/>
+          <w:szCs w:val="20"/>
+        </w:rPr>
+      </w:pPr>
+      <w:r>
+        <w:rPr>
+          <w:sz w:val="20"/>
+          <w:szCs w:val="20"/>
+        </w:rPr>
+        <w:t>Clock cycle estimates are no longer presented by the upgraded ISA disassembly view in the RGA GUI application.</w:t>
+      </w:r>
+    </w:p>
+    <w:p>
+      <w:pPr>
+        <w:pStyle w:val="ListParagraph"/>
+        <w:numPr>
+          <w:ilvl w:val="0"/>
+          <w:numId w:val="14"/>
+        </w:numPr>
+        <w:shd w:val="clear" w:color="auto" w:fill="FFFFFF"/>
+        <w:spacing w:before="100" w:beforeAutospacing="1" w:after="100" w:afterAutospacing="1" w:line="240" w:lineRule="auto"/>
+        <w:rPr>
+          <w:sz w:val="20"/>
+          <w:szCs w:val="20"/>
+        </w:rPr>
+      </w:pPr>
+      <w:r>
+        <w:rPr>
+          <w:sz w:val="20"/>
+          <w:szCs w:val="20"/>
+        </w:rPr>
+        <w:t>The new disassembly view presents Functional Groups, leveraging the AMD GPU machine-readable ISA documentation.</w:t>
+      </w:r>
+    </w:p>
+    <w:p>
+      <w:pPr>
+        <w:pStyle w:val="ListParagraph"/>
+        <w:numPr>
+          <w:ilvl w:val="0"/>
+          <w:numId w:val="14"/>
+        </w:numPr>
+        <w:shd w:val="clear" w:color="auto" w:fill="FFFFFF"/>
+        <w:spacing w:before="100" w:beforeAutospacing="1" w:after="100" w:afterAutospacing="1" w:line="240" w:lineRule="auto"/>
+        <w:rPr>
+          <w:sz w:val="20"/>
+          <w:szCs w:val="20"/>
+        </w:rPr>
+      </w:pPr>
+      <w:r>
+        <w:rPr>
+          <w:sz w:val="20"/>
+          <w:szCs w:val="20"/>
+        </w:rPr>
+        <w:t xml:space="preserve">For backward compatibility, the RGA CLI output presents Cycle estimates and Functional Unit fields </w:t>
+      </w:r>
+      <w:proofErr w:type="gramStart"/>
+      <w:r>
+        <w:rPr>
+          <w:sz w:val="20"/>
+          <w:szCs w:val="20"/>
+        </w:rPr>
+        <w:t>similar to</w:t>
+      </w:r>
+      <w:proofErr w:type="gramEnd"/>
+      <w:r>
+        <w:rPr>
+          <w:sz w:val="20"/>
+          <w:szCs w:val="20"/>
+        </w:rPr>
+        <w:t xml:space="preserve"> RGA 2.11.</w:t>
+      </w:r>
+    </w:p>
+    <w:p>
+      <w:pPr>
+        <w:pStyle w:val="ListParagraph"/>
+        <w:numPr>
+          <w:ilvl w:val="0"/>
+          <w:numId w:val="14"/>
+        </w:numPr>
+        <w:shd w:val="clear" w:color="auto" w:fill="FFFFFF"/>
+        <w:spacing w:before="100" w:beforeAutospacing="1" w:after="100" w:afterAutospacing="1" w:line="240" w:lineRule="auto"/>
+        <w:rPr>
+          <w:sz w:val="20"/>
+          <w:szCs w:val="20"/>
+        </w:rPr>
+      </w:pPr>
+      <w:r>
+        <w:rPr>
+          <w:sz w:val="20"/>
+          <w:szCs w:val="20"/>
+        </w:rPr>
         <w:t xml:space="preserve">We are working on a revised performance estimate mechanism and will share more details </w:t>
       </w:r>
       <w:proofErr w:type="gramStart"/>
@@ -363,7 +469,7 @@
           <w:sz w:val="20"/>
           <w:szCs w:val="20"/>
         </w:rPr>
-        <w:t>Source to disassembly correlation is not supported by AMD’s shader compiler and is therefore not supported in the UI.</w:t>
+        <w:t>Source-to-disassembly line correlation is experimental in this release and may not be accurate in all cases.</w:t>
       </w:r>
     </w:p>
     <w:p>
@@ -423,14 +529,14 @@
           <w:sz w:val="20"/>
           <w:szCs w:val="20"/>
         </w:rPr>
-        <w:t xml:space="preserve">Notifications about the fact that modified SPIR-V binary does not match the disassembly will not appear for loaded projects (in case </w:t>
-      </w:r>
-      <w:r>
-        <w:rPr>
-          <w:sz w:val="20"/>
-          <w:szCs w:val="20"/>
-        </w:rPr>
-        <w:t>where the user</w:t>
+        <w:t xml:space="preserve">Notifications about the fact that modified SPIR-V binary does not match the disassembly will not appear for loaded projects (if </w:t>
+      </w:r>
+      <w:r>
+        <w:rPr>
+          <w:sz w:val="20"/>
+          <w:szCs w:val="20"/>
+        </w:rPr>
+        <w:t>the user</w:t>
       </w:r>
       <w:r>
         <w:rPr>
@@ -555,7 +661,7 @@
           <w:sz w:val="20"/>
           <w:szCs w:val="20"/>
         </w:rPr>
-        <w:t>On Windows 11, Hull shader AMDIL disassembly contains a trail of a few garbage characters.</w:t>
+        <w:t>On Windows 11, Hull shader AMDIL disassembly contains a few trailing garbage characters.</w:t>
       </w:r>
     </w:p>
     <w:p>
@@ -4684,18 +4790,6 @@
     </w:p>
     <w:p>
       <w:pPr>
-        <w:pStyle w:val="Heading2"/>
-        <w:rPr>
-          <w:sz w:val="20"/>
-          <w:szCs w:val="20"/>
-        </w:rPr>
-      </w:pPr>
-      <w:r>
-        <w:t>General</w:t>
-      </w:r>
-    </w:p>
-    <w:p>
-      <w:pPr>
         <w:pStyle w:val="Heading1"/>
       </w:pPr>
       <w:r>
@@ -4782,7 +4876,7 @@
           <w:sz w:val="20"/>
           <w:szCs w:val="20"/>
         </w:rPr>
-        <w:t>It is generally recommended to use RGA with the latest Radeon Software version. Specifically, to target the RDNA architecture, the latest Radeon Software version is required (except for all Vulkan® modes</w:t>
+        <w:t>It is generally recommended to use RGA with the latest Radeon Software version. Specifically, to target the RDNA architecture, the latest Radeon Software version is required (except Vulkan®</w:t>
       </w:r>
       <w:r>
         <w:rPr>
@@ -4796,21 +4890,21 @@
           <w:sz w:val="20"/>
           <w:szCs w:val="20"/>
         </w:rPr>
-        <w:t xml:space="preserve"> OpenCL mode</w:t>
-      </w:r>
-      <w:r>
-        <w:rPr>
-          <w:sz w:val="20"/>
-          <w:szCs w:val="20"/>
-        </w:rPr>
-        <w:t>, OpenGL mode and DX11 mode</w:t>
-      </w:r>
-      <w:r>
-        <w:rPr>
-          <w:sz w:val="20"/>
-          <w:szCs w:val="20"/>
-        </w:rPr>
-        <w:t xml:space="preserve"> which are independent of the driver).</w:t>
+        <w:t xml:space="preserve"> OpenCL</w:t>
+      </w:r>
+      <w:r>
+        <w:rPr>
+          <w:sz w:val="20"/>
+          <w:szCs w:val="20"/>
+        </w:rPr>
+        <w:t>, OpenGL, and DX11 modes</w:t>
+      </w:r>
+      <w:r>
+        <w:rPr>
+          <w:sz w:val="20"/>
+          <w:szCs w:val="20"/>
+        </w:rPr>
+        <w:t xml:space="preserve">, which are independent of the driver).</w:t>
       </w:r>
     </w:p>
     <w:p>
@@ -5214,6 +5308,177 @@
           <w:szCs w:val="20"/>
         </w:rPr>
         <w:t>) is independent of the installed driver and graphics hardware and should work on any x86-based system.</w:t>
+      </w:r>
+    </w:p>
+    <w:p>
+      <w:pPr>
+        <w:pStyle w:val="Heading1"/>
+      </w:pPr>
+      <w:r>
+        <w:t>Release Notes History</w:t>
+      </w:r>
+    </w:p>
+    <w:p>
+      <w:pPr>
+        <w:shd w:val="clear" w:color="auto" w:fill="FFFFFF"/>
+        <w:spacing w:before="100" w:beforeAutospacing="1" w:after="100" w:afterAutospacing="1" w:line="240" w:lineRule="auto"/>
+        <w:rPr>
+          <w:b/>
+          <w:bCs/>
+          <w:sz w:val="20"/>
+          <w:szCs w:val="20"/>
+        </w:rPr>
+      </w:pPr>
+      <w:r>
+        <w:rPr>
+          <w:b w:val="0"/>
+          <w:bCs/>
+          <w:sz w:val="20"/>
+          <w:szCs w:val="20"/>
+        </w:rPr>
+        <w:t>This section summarizes the Highlights from prior RGA releases.</w:t>
+      </w:r>
+      <w:r>
+        <w:rPr>
+          <w:b/>
+          <w:bCs/>
+          <w:sz w:val="20"/>
+          <w:szCs w:val="20"/>
+        </w:rPr>
+      </w:r>
+    </w:p>
+    <w:p>
+      <w:pPr>
+        <w:pStyle w:val="Heading2"/>
+      </w:pPr>
+      <w:r>
+        <w:t>RGA 2.14</w:t>
+      </w:r>
+    </w:p>
+    <w:p>
+      <w:pPr>
+        <w:pStyle w:val="ListParagraph"/>
+        <w:numPr>
+          <w:ilvl w:val="0"/>
+          <w:numId w:val="14"/>
+        </w:numPr>
+        <w:shd w:val="clear" w:color="auto" w:fill="FFFFFF"/>
+        <w:spacing w:before="100" w:beforeAutospacing="1" w:after="100" w:afterAutospacing="1" w:line="240" w:lineRule="auto"/>
+        <w:rPr>
+          <w:sz w:val="20"/>
+          <w:szCs w:val="20"/>
+        </w:rPr>
+      </w:pPr>
+      <w:r>
+        <w:rPr>
+          <w:sz w:val="20"/>
+          <w:szCs w:val="20"/>
+        </w:rPr>
+        <w:t>Analyze precompiled HIP GPU Code Object binaries for the MI-350 (gfx950 CDNA™ 4 architecture) with RGA's Binary Analysis mode.</w:t>
+      </w:r>
+    </w:p>
+    <w:p>
+      <w:pPr>
+        <w:pStyle w:val="ListParagraph"/>
+        <w:numPr>
+          <w:ilvl w:val="0"/>
+          <w:numId w:val="14"/>
+        </w:numPr>
+        <w:shd w:val="clear" w:color="auto" w:fill="FFFFFF"/>
+        <w:spacing w:before="100" w:beforeAutospacing="1" w:after="100" w:afterAutospacing="1" w:line="240" w:lineRule="auto"/>
+        <w:rPr>
+          <w:sz w:val="20"/>
+          <w:szCs w:val="20"/>
+        </w:rPr>
+      </w:pPr>
+      <w:r>
+        <w:rPr>
+          <w:sz w:val="20"/>
+          <w:szCs w:val="20"/>
+        </w:rPr>
+        <w:t>Compile and analyze OpenCL™ kernels for MI-350 (gfx950 CDNA™ 4 architecture).</w:t>
+      </w:r>
+    </w:p>
+    <w:p>
+      <w:pPr>
+        <w:pStyle w:val="ListParagraph"/>
+        <w:numPr>
+          <w:ilvl w:val="0"/>
+          <w:numId w:val="14"/>
+        </w:numPr>
+        <w:shd w:val="clear" w:color="auto" w:fill="FFFFFF"/>
+        <w:spacing w:before="100" w:beforeAutospacing="1" w:after="100" w:afterAutospacing="1" w:line="240" w:lineRule="auto"/>
+        <w:rPr>
+          <w:sz w:val="20"/>
+          <w:szCs w:val="20"/>
+        </w:rPr>
+      </w:pPr>
+      <w:r>
+        <w:rPr>
+          <w:sz w:val="20"/>
+          <w:szCs w:val="20"/>
+        </w:rPr>
+        <w:t>Added support for the gfx1153 as a compilation target across all RGA's modes.</w:t>
+      </w:r>
+    </w:p>
+    <w:p>
+      <w:pPr>
+        <w:pStyle w:val="Heading2"/>
+      </w:pPr>
+      <w:r>
+        <w:t>RGA 2.14.1</w:t>
+      </w:r>
+    </w:p>
+    <w:p>
+      <w:pPr>
+        <w:pStyle w:val="ListParagraph"/>
+        <w:numPr>
+          <w:ilvl w:val="0"/>
+          <w:numId w:val="14"/>
+        </w:numPr>
+        <w:shd w:val="clear" w:color="auto" w:fill="FFFFFF"/>
+        <w:spacing w:before="100" w:beforeAutospacing="1" w:after="100" w:afterAutospacing="1" w:line="240" w:lineRule="auto"/>
+        <w:rPr>
+          <w:sz w:val="20"/>
+          <w:szCs w:val="20"/>
+        </w:rPr>
+      </w:pPr>
+      <w:r>
+        <w:rPr>
+          <w:sz w:val="20"/>
+          <w:szCs w:val="20"/>
+        </w:rPr>
+        <w:t>Updated the disassembler, addressing a few stability issues.</w:t>
+      </w:r>
+    </w:p>
+    <w:p>
+      <w:pPr>
+        <w:pStyle w:val="Heading2"/>
+      </w:pPr>
+      <w:r>
+        <w:t>RGA 2.14.2</w:t>
+      </w:r>
+    </w:p>
+    <w:p>
+      <w:pPr>
+        <w:pStyle w:val="ListParagraph"/>
+        <w:numPr>
+          <w:ilvl w:val="0"/>
+          <w:numId w:val="14"/>
+        </w:numPr>
+        <w:shd w:val="clear" w:color="auto" w:fill="FFFFFF"/>
+        <w:spacing w:before="100" w:beforeAutospacing="1" w:after="100" w:afterAutospacing="1" w:line="240" w:lineRule="auto"/>
+        <w:rPr>
+          <w:sz w:val="20"/>
+          <w:szCs w:val="20"/>
+        </w:rPr>
+      </w:pPr>
+      <w:r>
+        <w:rPr>
+          <w:sz w:val="20"/>
+          <w:szCs w:val="20"/>
+        </w:rPr>
+        <w:t>Updated the disassembler, addressing a few stability issues.</w:t>
       </w:r>
     </w:p>
     <w:sectPr>

</xml_diff>